<commit_message>
add RG to BCTS blocks
</commit_message>
<xml_diff>
--- a/Documentation/ecaImprovementProject.docx
+++ b/Documentation/ecaImprovementProject.docx
@@ -913,21 +913,7 @@
         <w:rPr>
           <w:rFonts w:ascii="Calibri" w:hAnsi="Calibri" w:cs="Calibri"/>
         </w:rPr>
-        <w:t xml:space="preserve">In early 2024, the Woodlands Manager for the Cariboo Chilcotin business area requested a report comparing our ECA method (and numbers) to the Foresite deliverables within their annual </w:t>
-      </w:r>
-      <w:proofErr w:type="spellStart"/>
-      <w:r>
-        <w:rPr>
-          <w:rFonts w:ascii="Calibri" w:hAnsi="Calibri" w:cs="Calibri"/>
-        </w:rPr>
-        <w:t>Landbase</w:t>
-      </w:r>
-      <w:proofErr w:type="spellEnd"/>
-      <w:r>
-        <w:rPr>
-          <w:rFonts w:ascii="Calibri" w:hAnsi="Calibri" w:cs="Calibri"/>
-        </w:rPr>
-        <w:t xml:space="preserve"> Assessment Report</w:t>
+        <w:t>In early 2024, the Woodlands Manager for the Cariboo Chilcotin business area requested a report comparing our ECA method (and numbers) to the Foresite deliverables within their annual Landbase Assessment Report</w:t>
       </w:r>
       <w:r>
         <w:rPr>
@@ -1051,21 +1037,7 @@
         <w:rPr>
           <w:rFonts w:ascii="Calibri" w:hAnsi="Calibri" w:cs="Calibri"/>
         </w:rPr>
-        <w:t xml:space="preserve"> to meet </w:t>
-      </w:r>
-      <w:proofErr w:type="spellStart"/>
-      <w:r>
-        <w:rPr>
-          <w:rFonts w:ascii="Calibri" w:hAnsi="Calibri" w:cs="Calibri"/>
-        </w:rPr>
-        <w:t>Foresite’s</w:t>
-      </w:r>
-      <w:proofErr w:type="spellEnd"/>
-      <w:r>
-        <w:rPr>
-          <w:rFonts w:ascii="Calibri" w:hAnsi="Calibri" w:cs="Calibri"/>
-        </w:rPr>
-        <w:t xml:space="preserve"> standard include </w:t>
+        <w:t xml:space="preserve"> to meet Foresite’s standard include </w:t>
       </w:r>
       <w:r>
         <w:rPr>
@@ -1353,30 +1325,8 @@
         <w:rPr>
           <w:color w:val="548DD4" w:themeColor="text2" w:themeTint="99"/>
         </w:rPr>
-        <w:t xml:space="preserve">name, data source, type (recovering or </w:t>
-      </w:r>
-      <w:proofErr w:type="spellStart"/>
-      <w:r>
-        <w:rPr>
-          <w:color w:val="548DD4" w:themeColor="text2" w:themeTint="99"/>
-        </w:rPr>
-        <w:t>nonrecovering</w:t>
-      </w:r>
-      <w:proofErr w:type="spellEnd"/>
-      <w:r>
-        <w:rPr>
-          <w:color w:val="548DD4" w:themeColor="text2" w:themeTint="99"/>
-        </w:rPr>
-        <w:t xml:space="preserve">), and </w:t>
-      </w:r>
-      <w:proofErr w:type="spellStart"/>
-      <w:r>
-        <w:rPr>
-          <w:color w:val="548DD4" w:themeColor="text2" w:themeTint="99"/>
-        </w:rPr>
-        <w:t>startingPercent</w:t>
-      </w:r>
-      <w:proofErr w:type="spellEnd"/>
+        <w:t>name, data source, type (recovering or nonrecovering), and startingPercent</w:t>
+      </w:r>
       <w:r>
         <w:t>.</w:t>
       </w:r>
@@ -1463,25 +1413,7 @@
           <w:bCs/>
           <w:color w:val="76923C" w:themeColor="accent3" w:themeShade="BF"/>
         </w:rPr>
-        <w:t>__</w:t>
-      </w:r>
-      <w:proofErr w:type="spellStart"/>
-      <w:r>
-        <w:rPr>
-          <w:b/>
-          <w:bCs/>
-          <w:color w:val="76923C" w:themeColor="accent3" w:themeShade="BF"/>
-        </w:rPr>
-        <w:t>init</w:t>
-      </w:r>
-      <w:proofErr w:type="spellEnd"/>
-      <w:r>
-        <w:rPr>
-          <w:b/>
-          <w:bCs/>
-          <w:color w:val="76923C" w:themeColor="accent3" w:themeShade="BF"/>
-        </w:rPr>
-        <w:t>__</w:t>
+        <w:t>__init__</w:t>
       </w:r>
     </w:p>
     <w:p>
@@ -1501,13 +1433,8 @@
         <w:t xml:space="preserve"> performed on them</w:t>
       </w:r>
       <w:r>
-        <w:t xml:space="preserve"> during initialization (__</w:t>
-      </w:r>
-      <w:proofErr w:type="spellStart"/>
-      <w:r>
-        <w:t>init</w:t>
-      </w:r>
-      <w:proofErr w:type="spellEnd"/>
+        <w:t xml:space="preserve"> during initialization (__init</w:t>
+      </w:r>
       <w:r>
         <w:t>__)</w:t>
       </w:r>
@@ -1539,15 +1466,7 @@
         <w:ind w:left="360" w:firstLine="360"/>
       </w:pPr>
       <w:r>
-        <w:t xml:space="preserve"> Adds field </w:t>
-      </w:r>
-      <w:proofErr w:type="spellStart"/>
-      <w:r>
-        <w:t>StartingPercent</w:t>
-      </w:r>
-      <w:proofErr w:type="spellEnd"/>
-      <w:r>
-        <w:t xml:space="preserve"> and assigns values based on</w:t>
+        <w:t xml:space="preserve"> Adds field StartingPercent and assigns values based on</w:t>
       </w:r>
       <w:r>
         <w:t xml:space="preserve"> data source and/or field</w:t>
@@ -1655,23 +1574,7 @@
         <w:ind w:left="1800"/>
       </w:pPr>
       <w:r>
-        <w:t>Harvest blocks (</w:t>
-      </w:r>
-      <w:proofErr w:type="spellStart"/>
-      <w:r>
-        <w:t>consolidatedBlk</w:t>
-      </w:r>
-      <w:proofErr w:type="spellEnd"/>
-      <w:r>
-        <w:t xml:space="preserve">, </w:t>
-      </w:r>
-      <w:proofErr w:type="spellStart"/>
-      <w:r>
-        <w:t>bctsBlk</w:t>
-      </w:r>
-      <w:proofErr w:type="spellEnd"/>
-      <w:r>
-        <w:t>):</w:t>
+        <w:t>Harvest blocks (consolidatedBlk, bctsBlk):</w:t>
       </w:r>
     </w:p>
     <w:p>
@@ -1919,13 +1822,8 @@
         </w:tabs>
         <w:ind w:left="1080"/>
       </w:pPr>
-      <w:proofErr w:type="spellStart"/>
-      <w:r>
-        <w:t>ECA_Area</w:t>
-      </w:r>
-      <w:proofErr w:type="spellEnd"/>
-      <w:r>
-        <w:t>: stores the adjusted disturbed area</w:t>
+      <w:r>
+        <w:t>ECA_Area: stores the adjusted disturbed area</w:t>
       </w:r>
       <w:r>
         <w:t xml:space="preserve"> </w:t>
@@ -1936,15 +1834,7 @@
         <w:ind w:left="360"/>
       </w:pPr>
       <w:r>
-        <w:t xml:space="preserve">For non-recovering types, set all ECA_PERCENT values to the given </w:t>
-      </w:r>
-      <w:proofErr w:type="spellStart"/>
-      <w:r>
-        <w:t>startingPercent</w:t>
-      </w:r>
-      <w:proofErr w:type="spellEnd"/>
-      <w:r>
-        <w:t>.</w:t>
+        <w:t>For non-recovering types, set all ECA_PERCENT values to the given startingPercent.</w:t>
       </w:r>
     </w:p>
     <w:p>
@@ -1971,25 +1861,7 @@
           <w:bCs/>
           <w:color w:val="76923C" w:themeColor="accent3" w:themeShade="BF"/>
         </w:rPr>
-        <w:t>Method: recover(</w:t>
-      </w:r>
-      <w:proofErr w:type="spellStart"/>
-      <w:r>
-        <w:rPr>
-          <w:b/>
-          <w:bCs/>
-          <w:color w:val="76923C" w:themeColor="accent3" w:themeShade="BF"/>
-        </w:rPr>
-        <w:t>yearofDistFields</w:t>
-      </w:r>
-      <w:proofErr w:type="spellEnd"/>
-      <w:r>
-        <w:rPr>
-          <w:b/>
-          <w:bCs/>
-          <w:color w:val="76923C" w:themeColor="accent3" w:themeShade="BF"/>
-        </w:rPr>
-        <w:t>)</w:t>
+        <w:t>Method: recover(yearofDistFields)</w:t>
       </w:r>
       <w:r>
         <w:rPr>
@@ -2120,13 +1992,8 @@
         <w:t>f name ==</w:t>
       </w:r>
       <w:r>
-        <w:t xml:space="preserve"> </w:t>
-      </w:r>
-      <w:proofErr w:type="spellStart"/>
-      <w:r>
-        <w:t>bctsBlk</w:t>
-      </w:r>
-      <w:proofErr w:type="spellEnd"/>
+        <w:t xml:space="preserve"> bctsBlk</w:t>
+      </w:r>
       <w:r>
         <w:t>:</w:t>
       </w:r>
@@ -2254,40 +2121,22 @@
           <w:color w:val="76923C" w:themeColor="accent3" w:themeShade="BF"/>
         </w:rPr>
         <w:lastRenderedPageBreak/>
-        <w:t xml:space="preserve">Method: </w:t>
-      </w:r>
-      <w:proofErr w:type="spellStart"/>
+        <w:t>Method: calculateECApercentage()</w:t>
+      </w:r>
       <w:r>
         <w:rPr>
           <w:b/>
           <w:bCs/>
           <w:color w:val="76923C" w:themeColor="accent3" w:themeShade="BF"/>
         </w:rPr>
-        <w:t>calculateECApercentage</w:t>
-      </w:r>
-      <w:proofErr w:type="spellEnd"/>
-      <w:r>
+        <w:t xml:space="preserve"> – outputs a percentage</w:t>
+      </w:r>
+    </w:p>
+    <w:p>
+      <w:pPr>
         <w:rPr>
           <w:b/>
           <w:bCs/>
-          <w:color w:val="76923C" w:themeColor="accent3" w:themeShade="BF"/>
-        </w:rPr>
-        <w:t>()</w:t>
-      </w:r>
-      <w:r>
-        <w:rPr>
-          <w:b/>
-          <w:bCs/>
-          <w:color w:val="76923C" w:themeColor="accent3" w:themeShade="BF"/>
-        </w:rPr>
-        <w:t xml:space="preserve"> – outputs a percentage</w:t>
-      </w:r>
-    </w:p>
-    <w:p>
-      <w:pPr>
-        <w:rPr>
-          <w:b/>
-          <w:bCs/>
         </w:rPr>
       </w:pPr>
       <w:r>
@@ -2295,10 +2144,16 @@
           <w:noProof/>
         </w:rPr>
         <w:drawing>
-          <wp:inline distT="0" distB="0" distL="0" distR="0" wp14:anchorId="646E170B" wp14:editId="1FCA6995">
-            <wp:extent cx="5151120" cy="3535082"/>
+          <wp:inline distT="0" distB="0" distL="0" distR="0" wp14:anchorId="30E0C8C8" wp14:editId="1FD5BF30">
+            <wp:extent cx="5943600" cy="3687445"/>
             <wp:effectExtent l="0" t="0" r="0" b="8255"/>
-            <wp:docPr id="497567512" name="Picture 1" descr="A graph of height and height&#10;&#10;Description automatically generated"/>
+            <wp:docPr id="6" name="Picture 5">
+              <a:extLst xmlns:a="http://schemas.openxmlformats.org/drawingml/2006/main">
+                <a:ext uri="{FF2B5EF4-FFF2-40B4-BE49-F238E27FC236}">
+                  <a16:creationId xmlns:a16="http://schemas.microsoft.com/office/drawing/2014/main" id="{B0CA1258-EA5A-8BA0-BD11-86A1DE266D7D}"/>
+                </a:ext>
+              </a:extLst>
+            </wp:docPr>
             <wp:cNvGraphicFramePr>
               <a:graphicFrameLocks xmlns:a="http://schemas.openxmlformats.org/drawingml/2006/main" noChangeAspect="1"/>
             </wp:cNvGraphicFramePr>
@@ -2306,23 +2161,39 @@
               <a:graphicData uri="http://schemas.openxmlformats.org/drawingml/2006/picture">
                 <pic:pic xmlns:pic="http://schemas.openxmlformats.org/drawingml/2006/picture">
                   <pic:nvPicPr>
-                    <pic:cNvPr id="497567512" name="Picture 1" descr="A graph of height and height&#10;&#10;Description automatically generated"/>
-                    <pic:cNvPicPr/>
+                    <pic:cNvPr id="6" name="Picture 5">
+                      <a:extLst>
+                        <a:ext uri="{FF2B5EF4-FFF2-40B4-BE49-F238E27FC236}">
+                          <a16:creationId xmlns:a16="http://schemas.microsoft.com/office/drawing/2014/main" id="{B0CA1258-EA5A-8BA0-BD11-86A1DE266D7D}"/>
+                        </a:ext>
+                      </a:extLst>
+                    </pic:cNvPr>
+                    <pic:cNvPicPr>
+                      <a:picLocks noChangeAspect="1" noChangeArrowheads="1"/>
+                    </pic:cNvPicPr>
                   </pic:nvPicPr>
                   <pic:blipFill>
-                    <a:blip r:embed="rId11"/>
+                    <a:blip r:embed="rId11">
+                      <a:extLst>
+                        <a:ext uri="{28A0092B-C50C-407E-A947-70E740481C1C}">
+                          <a14:useLocalDpi xmlns:a14="http://schemas.microsoft.com/office/drawing/2010/main" val="0"/>
+                        </a:ext>
+                      </a:extLst>
+                    </a:blip>
+                    <a:srcRect/>
                     <a:stretch>
                       <a:fillRect/>
                     </a:stretch>
                   </pic:blipFill>
-                  <pic:spPr>
+                  <pic:spPr bwMode="auto">
                     <a:xfrm>
                       <a:off x="0" y="0"/>
-                      <a:ext cx="5177038" cy="3552869"/>
+                      <a:ext cx="5943600" cy="3687445"/>
                     </a:xfrm>
                     <a:prstGeom prst="rect">
                       <a:avLst/>
                     </a:prstGeom>
+                    <a:noFill/>
                   </pic:spPr>
                 </pic:pic>
               </a:graphicData>
@@ -2477,38 +2348,20 @@
           <w:bCs/>
           <w:color w:val="76923C" w:themeColor="accent3" w:themeShade="BF"/>
         </w:rPr>
-        <w:t xml:space="preserve">Method: </w:t>
-      </w:r>
-      <w:proofErr w:type="spellStart"/>
+        <w:lastRenderedPageBreak/>
+        <w:t>Method: calculateECAarea()</w:t>
+      </w:r>
       <w:r>
         <w:rPr>
           <w:b/>
           <w:bCs/>
           <w:color w:val="76923C" w:themeColor="accent3" w:themeShade="BF"/>
         </w:rPr>
-        <w:t>calculateECAarea</w:t>
-      </w:r>
-      <w:proofErr w:type="spellEnd"/>
-      <w:r>
-        <w:rPr>
-          <w:b/>
-          <w:bCs/>
-          <w:color w:val="76923C" w:themeColor="accent3" w:themeShade="BF"/>
-        </w:rPr>
-        <w:t>()</w:t>
-      </w:r>
-      <w:r>
-        <w:rPr>
-          <w:b/>
-          <w:bCs/>
-          <w:color w:val="76923C" w:themeColor="accent3" w:themeShade="BF"/>
-        </w:rPr>
         <w:t xml:space="preserve"> – outputs an area</w:t>
       </w:r>
     </w:p>
     <w:p>
       <w:r>
-        <w:lastRenderedPageBreak/>
         <w:t>This method c</w:t>
       </w:r>
       <w:r>
@@ -2525,13 +2378,8 @@
           <w:numId w:val="20"/>
         </w:numPr>
       </w:pPr>
-      <w:proofErr w:type="spellStart"/>
-      <w:r>
-        <w:t>ECA_Area</w:t>
-      </w:r>
-      <w:proofErr w:type="spellEnd"/>
-      <w:r>
-        <w:t xml:space="preserve"> = (ECA_PERCENT / 100) * AREA</w:t>
+      <w:r>
+        <w:t>ECA_Area = (ECA_PERCENT / 100) * AREA</w:t>
       </w:r>
     </w:p>
     <w:p>
@@ -2601,77 +2449,13 @@
         </w:rPr>
         <w:t xml:space="preserve">Function: </w:t>
       </w:r>
-      <w:proofErr w:type="spellStart"/>
       <w:r>
         <w:rPr>
           <w:b/>
           <w:bCs/>
           <w:color w:val="76923C" w:themeColor="accent3" w:themeShade="BF"/>
         </w:rPr>
-        <w:t>writetoExcel</w:t>
-      </w:r>
-      <w:proofErr w:type="spellEnd"/>
-      <w:r>
-        <w:rPr>
-          <w:b/>
-          <w:bCs/>
-          <w:color w:val="76923C" w:themeColor="accent3" w:themeShade="BF"/>
-        </w:rPr>
-        <w:t xml:space="preserve">(watershed, </w:t>
-      </w:r>
-      <w:proofErr w:type="spellStart"/>
-      <w:r>
-        <w:rPr>
-          <w:b/>
-          <w:bCs/>
-          <w:color w:val="76923C" w:themeColor="accent3" w:themeShade="BF"/>
-        </w:rPr>
-        <w:t>inECAMerged</w:t>
-      </w:r>
-      <w:proofErr w:type="spellEnd"/>
-      <w:r>
-        <w:rPr>
-          <w:b/>
-          <w:bCs/>
-          <w:color w:val="76923C" w:themeColor="accent3" w:themeShade="BF"/>
-        </w:rPr>
-        <w:t xml:space="preserve">, </w:t>
-      </w:r>
-      <w:proofErr w:type="spellStart"/>
-      <w:r>
-        <w:rPr>
-          <w:b/>
-          <w:bCs/>
-          <w:color w:val="76923C" w:themeColor="accent3" w:themeShade="BF"/>
-        </w:rPr>
-        <w:t>subBasin</w:t>
-      </w:r>
-      <w:proofErr w:type="spellEnd"/>
-      <w:r>
-        <w:rPr>
-          <w:b/>
-          <w:bCs/>
-          <w:color w:val="76923C" w:themeColor="accent3" w:themeShade="BF"/>
-        </w:rPr>
-        <w:t xml:space="preserve">, </w:t>
-      </w:r>
-      <w:proofErr w:type="spellStart"/>
-      <w:r>
-        <w:rPr>
-          <w:b/>
-          <w:bCs/>
-          <w:color w:val="76923C" w:themeColor="accent3" w:themeShade="BF"/>
-        </w:rPr>
-        <w:t>subBasinName</w:t>
-      </w:r>
-      <w:proofErr w:type="spellEnd"/>
-      <w:r>
-        <w:rPr>
-          <w:b/>
-          <w:bCs/>
-          <w:color w:val="76923C" w:themeColor="accent3" w:themeShade="BF"/>
-        </w:rPr>
-        <w:t>)</w:t>
+        <w:t>writetoExcel(watershed, inECAMerged, subBasin, subBasinName)</w:t>
       </w:r>
       <w:r>
         <w:t xml:space="preserve"> </w:t>
@@ -2816,21 +2600,12 @@
       <w:r>
         <w:t xml:space="preserve">To incorporate feature classes with a starting percentage below 100%—such as areas affected by burn severity or pests—I converted the initial ECA percentage (e.g., 10% for low burn severity) to height in meters using the inverse ECA curve. The stand was then grown from this height, and the current ECA percentage was calculated by converting back using the </w:t>
       </w:r>
-      <w:proofErr w:type="spellStart"/>
       <w:r>
         <w:rPr>
           <w:i/>
           <w:iCs/>
         </w:rPr>
-        <w:t>calculateECApercentage</w:t>
-      </w:r>
-      <w:proofErr w:type="spellEnd"/>
-      <w:r>
-        <w:rPr>
-          <w:i/>
-          <w:iCs/>
-        </w:rPr>
-        <w:t>()</w:t>
+        <w:t>calculateECApercentage()</w:t>
       </w:r>
       <w:r>
         <w:t xml:space="preserve"> </w:t>
@@ -2856,7 +2631,6 @@
         </w:numPr>
       </w:pPr>
       <w:r>
-        <w:lastRenderedPageBreak/>
         <w:t>Null values were as prevalent as expected, requiring numerous code snippets to handle them effectively. For example:</w:t>
       </w:r>
     </w:p>
@@ -3010,23 +2784,7 @@
           <w:i/>
           <w:iCs/>
         </w:rPr>
-        <w:t xml:space="preserve">he VRI polygons in the western region appearing in </w:t>
-      </w:r>
-      <w:proofErr w:type="spellStart"/>
-      <w:r>
-        <w:rPr>
-          <w:i/>
-          <w:iCs/>
-        </w:rPr>
-        <w:t>Foresite’s</w:t>
-      </w:r>
-      <w:proofErr w:type="spellEnd"/>
-      <w:r>
-        <w:rPr>
-          <w:i/>
-          <w:iCs/>
-        </w:rPr>
-        <w:t xml:space="preserve"> results were not present in our </w:t>
+        <w:t xml:space="preserve">he VRI polygons in the western region appearing in Foresite’s results were not present in our </w:t>
       </w:r>
       <w:r>
         <w:rPr>
@@ -3545,23 +3303,7 @@
           <w:sz w:val="20"/>
           <w:szCs w:val="20"/>
         </w:rPr>
-        <w:t xml:space="preserve">Bryant, P., May 2023. </w:t>
-      </w:r>
-      <w:proofErr w:type="spellStart"/>
-      <w:r>
-        <w:rPr>
-          <w:sz w:val="20"/>
-          <w:szCs w:val="20"/>
-        </w:rPr>
-        <w:t>Landbase</w:t>
-      </w:r>
-      <w:proofErr w:type="spellEnd"/>
-      <w:r>
-        <w:rPr>
-          <w:sz w:val="20"/>
-          <w:szCs w:val="20"/>
-        </w:rPr>
-        <w:t xml:space="preserve"> Assessments for the Cariboo Region. Version 1.0. </w:t>
+        <w:t xml:space="preserve">Bryant, P., May 2023. Landbase Assessments for the Cariboo Region. Version 1.0. </w:t>
       </w:r>
       <w:r>
         <w:rPr>

</xml_diff>